<commit_message>
Adding SHA Hash and PGP Signature of SHA Hash File
 On branch working
 Changes to be committed:
	modified:   DIY_Hotspot/Config/Image_Info/2024_04_30_Pi-Star_MVP.img.sha
	new file:   DIY_Hotspot/Config/Image_Info/2024_04_30_Pi-Star_MVP.img.sha.sig
	modified:   DIY_Hotspot/Config/Image_Info/Notes.docx
	new file:   DIY_Hotspot/Config/Image_Info/README.txt
</commit_message>
<xml_diff>
--- a/DIY_Hotspot/Config/Image_Info/Notes.docx
+++ b/DIY_Hotspot/Config/Image_Info/Notes.docx
@@ -256,27 +256,7 @@
           <w:color w:val="00A933"/>
           <w:shd w:fill="auto" w:val="clear"/>
         </w:rPr>
-        <w:t>sudo dd if=/dev/sdb of=</w:t>
-      </w:r>
-      <w:r>
-        <w:rPr>
-          <w:rFonts w:ascii="Liberation Sans" w:hAnsi="Liberation Sans"/>
-          <w:b/>
-          <w:bCs/>
-          <w:color w:val="00A933"/>
-          <w:shd w:fill="auto" w:val="clear"/>
-        </w:rPr>
-        <w:t>2024_04_30_Pi-Star_MVP</w:t>
-      </w:r>
-      <w:r>
-        <w:rPr>
-          <w:rFonts w:ascii="Liberation Sans" w:hAnsi="Liberation Sans"/>
-          <w:b/>
-          <w:bCs/>
-          <w:color w:val="00A933"/>
-          <w:shd w:fill="auto" w:val="clear"/>
-        </w:rPr>
-        <w:t>.img bs=1M</w:t>
+        <w:t>sudo dd if=/dev/sdb of=2024_04_30_Pi-Star_MVP.img bs=1M</w:t>
       </w:r>
     </w:p>
     <w:p>
@@ -480,17 +460,7 @@
           <w:szCs w:val="24"/>
           <w:shd w:fill="auto" w:val="clear"/>
         </w:rPr>
-        <w:t xml:space="preserve">sha256sum </w:t>
-      </w:r>
-      <w:r>
-        <w:rPr>
-          <w:rStyle w:val="SourceText"/>
-          <w:rFonts w:ascii="Liberation Sans" w:hAnsi="Liberation Sans"/>
-          <w:sz w:val="24"/>
-          <w:szCs w:val="24"/>
-          <w:shd w:fill="auto" w:val="clear"/>
-        </w:rPr>
-        <w:t>file.ext</w:t>
+        <w:t>sha256sum file.ext</w:t>
       </w:r>
     </w:p>
     <w:p>
@@ -507,7 +477,12 @@
         </w:rPr>
       </w:pPr>
       <w:r>
-        <w:rPr/>
+        <w:rPr>
+          <w:rFonts w:ascii="Liberation Sans" w:hAnsi="Liberation Sans"/>
+          <w:sz w:val="24"/>
+          <w:szCs w:val="24"/>
+          <w:shd w:fill="auto" w:val="clear"/>
+        </w:rPr>
       </w:r>
     </w:p>
     <w:p>
@@ -561,7 +536,8 @@
           <w:b/>
           <w:bCs/>
           <w:color w:val="00A933"/>
-          <w:shd w:fill="auto" w:val="clear"/>
+          <w:sz w:val="24"/>
+          <w:szCs w:val="24"/>
         </w:rPr>
       </w:r>
     </w:p>
@@ -621,6 +597,54 @@
           <w:shd w:fill="auto" w:val="clear"/>
         </w:rPr>
         <w:t>02784de6c4ff2fa5c4018e97d851c6fea2f9205efc7b244bb1526b7037bea553  2024_04_30_Pi-Star_MVP.img</w:t>
+      </w:r>
+    </w:p>
+    <w:p>
+      <w:pPr>
+        <w:pStyle w:val="Normal"/>
+        <w:spacing w:before="0" w:after="283"/>
+        <w:ind w:left="720" w:hanging="0"/>
+        <w:rPr>
+          <w:rFonts w:ascii="Liberation Sans" w:hAnsi="Liberation Sans"/>
+          <w:b/>
+          <w:b/>
+          <w:bCs/>
+          <w:color w:val="00A933"/>
+          <w:highlight w:val="none"/>
+          <w:shd w:fill="auto" w:val="clear"/>
+        </w:rPr>
+      </w:pPr>
+      <w:r>
+        <w:rPr/>
+      </w:r>
+    </w:p>
+    <w:p>
+      <w:pPr>
+        <w:pStyle w:val="Normal"/>
+        <w:spacing w:before="0" w:after="283"/>
+        <w:ind w:left="720" w:hanging="0"/>
+        <w:rPr>
+          <w:rFonts w:ascii="Liberation Sans" w:hAnsi="Liberation Sans"/>
+          <w:b/>
+          <w:b/>
+          <w:bCs/>
+          <w:color w:val="00A933"/>
+          <w:highlight w:val="none"/>
+          <w:shd w:fill="auto" w:val="clear"/>
+        </w:rPr>
+      </w:pPr>
+      <w:r>
+        <w:rPr>
+          <w:rStyle w:val="SourceText"/>
+          <w:rFonts w:ascii="Liberation Sans" w:hAnsi="Liberation Sans"/>
+          <w:b/>
+          <w:bCs/>
+          <w:color w:val="00A933"/>
+          <w:sz w:val="24"/>
+          <w:szCs w:val="24"/>
+          <w:shd w:fill="auto" w:val="clear"/>
+        </w:rPr>
+        <w:t>SHA in Text file that is PGP signed with SteveN5QC 1H 2025 signing Key</w:t>
       </w:r>
     </w:p>
     <w:p>
@@ -1621,6 +1645,7 @@
     <w:qFormat/>
     <w:pPr>
       <w:widowControl/>
+      <w:suppressAutoHyphens w:val="true"/>
       <w:bidi w:val="0"/>
       <w:spacing w:lineRule="auto" w:line="276" w:before="0" w:after="160"/>
       <w:jc w:val="left"/>

</xml_diff>